<commit_message>
Add Hotjar to TOTVS tooling in resume
Matches the tools he actually used there and closes a keyword gap
against job postings that list Hotjar as a requirement.
</commit_message>
<xml_diff>
--- a/document/Curriculo-JoaoPedroSilvaTerra.docx
+++ b/document/Curriculo-JoaoPedroSilvaTerra.docx
@@ -59,7 +59,7 @@
         </w:rPr>
         <w:t xml:space="preserve">LinkedIn: </w:t>
       </w:r>
-      <w:hyperlink w:history="1" r:id="rIdqcpz5xoulouggwttjid6u">
+      <w:hyperlink w:history="1" r:id="rIdcqkxf0p36v_ke6fgugxso">
         <w:r>
           <w:rPr>
             <w:rFonts w:ascii="Calibri" w:cs="Calibri" w:eastAsia="Calibri" w:hAnsi="Calibri"/>
@@ -80,7 +80,7 @@
         </w:rPr>
         <w:t xml:space="preserve">  ·  Portfólio: </w:t>
       </w:r>
-      <w:hyperlink w:history="1" r:id="rIdsavk4icp1_7b75lzen1fk">
+      <w:hyperlink w:history="1" r:id="rIdxpcd7prv7ngtvan0eq82r">
         <w:r>
           <w:rPr>
             <w:rFonts w:ascii="Calibri" w:cs="Calibri" w:eastAsia="Calibri" w:hAnsi="Calibri"/>
@@ -101,7 +101,7 @@
         </w:rPr>
         <w:t xml:space="preserve">  ·  GitHub: </w:t>
       </w:r>
-      <w:hyperlink w:history="1" r:id="rIdzhlmxkiwebg3mmx97tm-g">
+      <w:hyperlink w:history="1" r:id="rIdgzkwugflgaql2ocgn0fv1">
         <w:r>
           <w:rPr>
             <w:rFonts w:ascii="Calibri" w:cs="Calibri" w:eastAsia="Calibri" w:hAnsi="Calibri"/>
@@ -122,7 +122,7 @@
         </w:rPr>
         <w:t xml:space="preserve">  ·  Behance: </w:t>
       </w:r>
-      <w:hyperlink w:history="1" r:id="rIdukha9mgcltz97-ce9bcte">
+      <w:hyperlink w:history="1" r:id="rIdfqgprucsmm9n9kxbbcusv">
         <w:r>
           <w:rPr>
             <w:rFonts w:ascii="Calibri" w:cs="Calibri" w:eastAsia="Calibri" w:hAnsi="Calibri"/>
@@ -241,7 +241,7 @@
           <w:sz w:val="19"/>
           <w:szCs w:val="19"/>
         </w:rPr>
-        <w:t xml:space="preserve">Prototipação de alta fidelidade para produtos web, mobile, legado e cliente-servidor (Figma, Miro)</w:t>
+        <w:t xml:space="preserve">Prototipação de alta fidelidade para produtos web, mobile, legado e cliente-servidor (Figma, Miro, Hotjar)</w:t>
       </w:r>
     </w:p>
     <w:p>

</xml_diff>

<commit_message>
Replace Hayai Shop mention with global e-commerce scale, drop em dashes
Swaps the ~140-order dropshipping callout for the fuller picture: 3,000+
orders managed end-to-end across Europe, the US, LATAM, and Brazil, on
both the PT and EN portfolio and the resume. Also removes stray em
dashes from the EN page and resume generator per style preference.
</commit_message>
<xml_diff>
--- a/document/Curriculo-JoaoPedroSilvaTerra.docx
+++ b/document/Curriculo-JoaoPedroSilvaTerra.docx
@@ -59,7 +59,7 @@
         </w:rPr>
         <w:t xml:space="preserve">LinkedIn: </w:t>
       </w:r>
-      <w:hyperlink w:history="1" r:id="rIdcqkxf0p36v_ke6fgugxso">
+      <w:hyperlink w:history="1" r:id="rIduidlvg7lhxluynj8bigb8">
         <w:r>
           <w:rPr>
             <w:rFonts w:ascii="Calibri" w:cs="Calibri" w:eastAsia="Calibri" w:hAnsi="Calibri"/>
@@ -80,7 +80,7 @@
         </w:rPr>
         <w:t xml:space="preserve">  ·  Portfólio: </w:t>
       </w:r>
-      <w:hyperlink w:history="1" r:id="rIdxpcd7prv7ngtvan0eq82r">
+      <w:hyperlink w:history="1" r:id="rIdd_bcz4bmihjo453w3fz97">
         <w:r>
           <w:rPr>
             <w:rFonts w:ascii="Calibri" w:cs="Calibri" w:eastAsia="Calibri" w:hAnsi="Calibri"/>
@@ -101,7 +101,7 @@
         </w:rPr>
         <w:t xml:space="preserve">  ·  GitHub: </w:t>
       </w:r>
-      <w:hyperlink w:history="1" r:id="rIdgzkwugflgaql2ocgn0fv1">
+      <w:hyperlink w:history="1" r:id="rIdqggpwelo6zgsyusmlckq6">
         <w:r>
           <w:rPr>
             <w:rFonts w:ascii="Calibri" w:cs="Calibri" w:eastAsia="Calibri" w:hAnsi="Calibri"/>
@@ -122,7 +122,7 @@
         </w:rPr>
         <w:t xml:space="preserve">  ·  Behance: </w:t>
       </w:r>
-      <w:hyperlink w:history="1" r:id="rIdfqgprucsmm9n9kxbbcusv">
+      <w:hyperlink w:history="1" r:id="rIdqz52-47556agnrcsetv4j">
         <w:r>
           <w:rPr>
             <w:rFonts w:ascii="Calibri" w:cs="Calibri" w:eastAsia="Calibri" w:hAnsi="Calibri"/>
@@ -222,7 +222,7 @@
           <w:sz w:val="18"/>
           <w:szCs w:val="18"/>
         </w:rPr>
-        <w:t xml:space="preserve">   —   Out 2023 – Fev 2026 (2a 5m) · Assis, SP</w:t>
+        <w:t xml:space="preserve">   ·   Out 2023 – Fev 2026 (2a 5m) · Assis, SP</w:t>
       </w:r>
     </w:p>
     <w:p>
@@ -334,7 +334,7 @@
           <w:sz w:val="18"/>
           <w:szCs w:val="18"/>
         </w:rPr>
-        <w:t xml:space="preserve">   —   Set 2022 – Out 2023 · Ourinhos, SP</w:t>
+        <w:t xml:space="preserve">   ·   Set 2022 – Out 2023 · Ourinhos, SP</w:t>
       </w:r>
     </w:p>
     <w:p>
@@ -408,7 +408,7 @@
           <w:sz w:val="18"/>
           <w:szCs w:val="18"/>
         </w:rPr>
-        <w:t xml:space="preserve">   —   Jan 2017 – Atual · Remoto</w:t>
+        <w:t xml:space="preserve">   ·   Jan 2017 – Atual · Remoto</w:t>
       </w:r>
     </w:p>
     <w:p>
@@ -571,7 +571,7 @@
           <w:sz w:val="18"/>
           <w:szCs w:val="18"/>
         </w:rPr>
-        <w:t xml:space="preserve">   —   2021 – 2025 · concluído · Ourinhos, SP</w:t>
+        <w:t xml:space="preserve">   ·   2021 – 2025 · concluído · Ourinhos, SP</w:t>
       </w:r>
     </w:p>
     <w:p>
@@ -607,7 +607,7 @@
           <w:sz w:val="18"/>
           <w:szCs w:val="18"/>
         </w:rPr>
-        <w:t xml:space="preserve">   —   2016 – 2019 · concluído · Ourinhos, SP</w:t>
+        <w:t xml:space="preserve">   ·   2016 – 2019 · concluído · Ourinhos, SP</w:t>
       </w:r>
     </w:p>
     <w:p>

</xml_diff>